<commit_message>
update: clearify the tools and ready to opreate
</commit_message>
<xml_diff>
--- a/docs/参赛要求编辑版.docx
+++ b/docs/参赛要求编辑版.docx
@@ -1003,7 +1003,27 @@
                 <w:szCs w:val="24"/>
                 <w:lang w:val="en-US" w:eastAsia="zh-CN" w:bidi="ar"/>
               </w:rPr>
-              <w:t>Agentic AI）协同技术，构建面向 ToC 场景的金融智能问答助手，解决多轮长对话下的精准记忆与动态工具调用问题，并实现复杂的股权穿透推理以及基于异构财报数据的造假风险智能鉴别与逻辑溯源。</w:t>
+              <w:t xml:space="preserve">Agentic AI）协同技术，构建面向 </w:t>
+            </w:r>
+            <w:proofErr w:type="spellStart"/>
+            <w:r>
+              <w:rPr>
+                <w:rFonts w:ascii="宋体" w:eastAsia="宋体" w:hAnsi="宋体" w:cs="宋体"/>
+                <w:sz w:val="24"/>
+                <w:szCs w:val="24"/>
+                <w:lang w:val="en-US" w:eastAsia="zh-CN" w:bidi="ar"/>
+              </w:rPr>
+              <w:t>ToC</w:t>
+            </w:r>
+            <w:proofErr w:type="spellEnd"/>
+            <w:r>
+              <w:rPr>
+                <w:rFonts w:ascii="宋体" w:eastAsia="宋体" w:hAnsi="宋体" w:cs="宋体"/>
+                <w:sz w:val="24"/>
+                <w:szCs w:val="24"/>
+                <w:lang w:val="en-US" w:eastAsia="zh-CN" w:bidi="ar"/>
+              </w:rPr>
+              <w:t xml:space="preserve"> 场景的金融智能问答助手，解决多轮长对话下的精准记忆与动态工具调用问题，并实现复杂的股权穿透推理以及基于异构财报数据的造假风险智能鉴别与逻辑溯源。</w:t>
             </w:r>
           </w:p>
         </w:tc>
@@ -1093,8 +1113,13 @@
               </w:rPr>
               <w:t>在当前面向个人投资者（</w:t>
             </w:r>
-            <w:r>
-              <w:t>ToC）的金融信息服务场景中，用户获取高深金融知识的门槛逐渐降低，对智能问答助手的期望已从“简单的信息检索”升级为“深度的逻辑推演与多维查证”。然而，现有的金融对话大模型在实际应用中面临以下三个核心瓶颈：</w:t>
+            <w:proofErr w:type="spellStart"/>
+            <w:r>
+              <w:t>ToC</w:t>
+            </w:r>
+            <w:proofErr w:type="spellEnd"/>
+            <w:r>
+              <w:t>）的金融信息服务场景中，用户获取高深金融知识的门槛逐渐降低，对智能问答助手的期望已从“简单的信息检索”升级为“深度的逻辑推演与多维查证”。然而，现有的金融对话大模型在实际应用中面临以下三个核心瓶颈：</w:t>
             </w:r>
           </w:p>
           <w:p>
@@ -1129,8 +1154,13 @@
                 <w:rFonts w:hint="eastAsia"/>
               </w:rPr>
             </w:pPr>
-            <w:r>
-              <w:t>ToC 用户的提问往往高度碎片化且跨度极大。在超过 10 轮以上、甚至超 0.5M Tokens 长度的连续或跨周期对话中，模型极易出现记忆混淆或上下文缺失。同时，面对海量动态的金融数</w:t>
+            <w:proofErr w:type="spellStart"/>
+            <w:r>
+              <w:t>ToC</w:t>
+            </w:r>
+            <w:proofErr w:type="spellEnd"/>
+            <w:r>
+              <w:t xml:space="preserve"> 用户的提问往往高度碎片化且跨度极大。在超过 10 轮以上、甚至超 0.5M Tokens 长度的连续或跨周期对话中，模型极易出现记忆混淆或上下文缺失。同时，面对海量动态的金融数</w:t>
             </w:r>
             <w:r>
               <w:lastRenderedPageBreak/>
@@ -1320,6 +1350,7 @@
                 <w:lang w:val="en-US" w:eastAsia="zh-CN"/>
               </w:rPr>
             </w:pPr>
+            <w:proofErr w:type="gramStart"/>
             <w:r>
               <w:rPr>
                 <w:rFonts w:ascii="宋体" w:eastAsia="宋体" w:hAnsi="Symbol" w:cs="宋体"/>
@@ -1345,11 +1376,21 @@
                 <w:sz w:val="24"/>
                 <w:lang w:val="en-US" w:eastAsia="zh-CN"/>
               </w:rPr>
-              <w:t>超长对话上下文精准管理与防幻觉的自适应工具调用：</w:t>
-            </w:r>
+              <w:t>超长对话上下文精准管理与防幻觉的自适应工具调用</w:t>
+            </w:r>
+            <w:proofErr w:type="gramEnd"/>
             <w:r>
               <w:rPr>
                 <w:rFonts w:cs="Times New Roman"/>
+                <w:b/>
+                <w:sz w:val="24"/>
+                <w:lang w:val="en-US" w:eastAsia="zh-CN"/>
+              </w:rPr>
+              <w:t>：</w:t>
+            </w:r>
+            <w:r>
+              <w:rPr>
+                <w:rFonts w:cs="Times New Roman"/>
                 <w:sz w:val="24"/>
                 <w:lang w:val="en-US" w:eastAsia="zh-CN"/>
               </w:rPr>
@@ -1410,6 +1451,7 @@
                 <w:lang w:val="en-US" w:eastAsia="zh-CN"/>
               </w:rPr>
             </w:pPr>
+            <w:proofErr w:type="gramStart"/>
             <w:r>
               <w:rPr>
                 <w:rFonts w:ascii="宋体" w:eastAsia="宋体" w:hAnsi="Symbol" w:cs="宋体"/>
@@ -1435,7 +1477,17 @@
                 <w:sz w:val="24"/>
                 <w:lang w:val="en-US" w:eastAsia="zh-CN"/>
               </w:rPr>
-              <w:t>异构财务数据的智能勾稽校验与造假预警逻辑可解释性：</w:t>
+              <w:t>异构财务数据的智能勾稽校验与造假预警逻辑可解释性</w:t>
+            </w:r>
+            <w:proofErr w:type="gramEnd"/>
+            <w:r>
+              <w:rPr>
+                <w:rFonts w:cs="Times New Roman"/>
+                <w:b/>
+                <w:sz w:val="24"/>
+                <w:lang w:val="en-US" w:eastAsia="zh-CN"/>
+              </w:rPr>
+              <w:t>：</w:t>
             </w:r>
             <w:r>
               <w:rPr>
@@ -1870,7 +1922,7 @@
               </w:numPr>
               <w:spacing w:before="100" w:beforeAutospacing="1" w:after="100" w:afterAutospacing="1" w:line="240" w:lineRule="auto"/>
               <w:rPr>
-                <w:rFonts w:ascii="宋体" w:eastAsia="宋体" w:hAnsi="宋体" w:cs="宋体" w:hint="eastAsia"/>
+                <w:rFonts w:ascii="宋体" w:eastAsia="宋体" w:hAnsi="宋体" w:cs="宋体"/>
                 <w:sz w:val="24"/>
                 <w:szCs w:val="24"/>
                 <w:lang w:val="en-US" w:eastAsia="zh-CN"/>
@@ -1895,6 +1947,54 @@
                 <w:lang w:val="en-US" w:eastAsia="zh-CN"/>
               </w:rPr>
               <w:t>：基于上述演算，针对目标财报生成多维风险评分，并输出结构化的诊断逻辑链（必须指明“预警点”、“数据对比”及“可能存在的造假模式或业务风险”）。</w:t>
+            </w:r>
+          </w:p>
+          <w:p>
+            <w:pPr>
+              <w:numPr>
+                <w:ilvl w:val="0"/>
+                <w:numId w:val="4"/>
+              </w:numPr>
+              <w:spacing w:before="100" w:beforeAutospacing="1" w:after="100" w:afterAutospacing="1" w:line="240" w:lineRule="auto"/>
+              <w:rPr>
+                <w:rFonts w:ascii="宋体" w:eastAsia="宋体" w:hAnsi="宋体" w:cs="宋体" w:hint="eastAsia"/>
+                <w:sz w:val="24"/>
+                <w:szCs w:val="24"/>
+                <w:lang w:val="en-US" w:eastAsia="zh-CN"/>
+              </w:rPr>
+            </w:pPr>
+            <w:r>
+              <w:rPr>
+                <w:rFonts w:ascii="宋体" w:eastAsia="宋体" w:hAnsi="宋体" w:cs="宋体" w:hint="eastAsia"/>
+                <w:sz w:val="24"/>
+                <w:szCs w:val="24"/>
+                <w:lang w:val="en-US" w:eastAsia="zh-CN"/>
+              </w:rPr>
+              <w:t>一、公司最近五年被证券监管部门和交易所处罚的情况</w:t>
+            </w:r>
+          </w:p>
+          <w:p>
+            <w:pPr>
+              <w:numPr>
+                <w:ilvl w:val="0"/>
+                <w:numId w:val="4"/>
+              </w:numPr>
+              <w:spacing w:before="100" w:beforeAutospacing="1" w:after="100" w:afterAutospacing="1" w:line="240" w:lineRule="auto"/>
+              <w:rPr>
+                <w:rFonts w:ascii="宋体" w:eastAsia="宋体" w:hAnsi="宋体" w:cs="宋体" w:hint="eastAsia"/>
+                <w:sz w:val="24"/>
+                <w:szCs w:val="24"/>
+                <w:lang w:val="en-US" w:eastAsia="zh-CN"/>
+              </w:rPr>
+            </w:pPr>
+            <w:r>
+              <w:rPr>
+                <w:rFonts w:ascii="宋体" w:eastAsia="宋体" w:hAnsi="宋体" w:cs="宋体" w:hint="eastAsia"/>
+                <w:sz w:val="24"/>
+                <w:szCs w:val="24"/>
+                <w:lang w:val="en-US" w:eastAsia="zh-CN"/>
+              </w:rPr>
+              <w:t>公司最近五年不存在被证券监管部门和交易所处罚的情况。</w:t>
             </w:r>
           </w:p>
         </w:tc>
@@ -2032,6 +2132,7 @@
                 <w:b/>
                 <w:bCs/>
               </w:rPr>
+              <w:lastRenderedPageBreak/>
               <w:t>数据资源沉淀</w:t>
             </w:r>
             <w:r>
@@ -2719,6 +2820,7 @@
                 <w:szCs w:val="24"/>
                 <w:lang w:val="en-US" w:eastAsia="zh-CN"/>
               </w:rPr>
+              <w:lastRenderedPageBreak/>
               <w:t>（</w:t>
             </w:r>
             <w:r>

</xml_diff>